<commit_message>
updated resume & publications
</commit_message>
<xml_diff>
--- a/content/files/alamine_resume_v2.docx
+++ b/content/files/alamine_resume_v2.docx
@@ -277,7 +277,7 @@
                 <w:sz w:val="28"/>
                 <w:szCs w:val="32"/>
               </w:rPr>
-              <w:t>,</w:t>
+              <w:t>;</w:t>
             </w:r>
             <w:r>
               <w:rPr>
@@ -285,6 +285,13 @@
                 <w:szCs w:val="32"/>
               </w:rPr>
               <w:t xml:space="preserve"> Macro Risk Unit</w:t>
+            </w:r>
+            <w:r>
+              <w:rPr>
+                <w:sz w:val="28"/>
+                <w:szCs w:val="32"/>
+              </w:rPr>
+              <w:t xml:space="preserve"> – Strategy, Policy, and Review Department</w:t>
             </w:r>
           </w:p>
           <w:p>
@@ -308,57 +315,55 @@
                 <w:szCs w:val="28"/>
                 <w:lang w:val="en-US"/>
               </w:rPr>
-              <w:t>Built and maintained</w:t>
-            </w:r>
-            <w:r>
-              <w:rPr>
-                <w:sz w:val="24"/>
-                <w:szCs w:val="28"/>
-                <w:lang w:val="en-US"/>
-              </w:rPr>
-              <w:t xml:space="preserve"> machine learning models </w:t>
-            </w:r>
-            <w:r>
-              <w:rPr>
-                <w:sz w:val="24"/>
-                <w:szCs w:val="28"/>
-                <w:lang w:val="en-US"/>
-              </w:rPr>
-              <w:t xml:space="preserve">for risk </w:t>
-            </w:r>
-            <w:proofErr w:type="gramStart"/>
-            <w:r>
-              <w:rPr>
-                <w:sz w:val="24"/>
-                <w:szCs w:val="28"/>
-                <w:lang w:val="en-US"/>
-              </w:rPr>
-              <w:t>management, and</w:t>
-            </w:r>
-            <w:proofErr w:type="gramEnd"/>
-            <w:r>
-              <w:rPr>
-                <w:sz w:val="24"/>
-                <w:szCs w:val="28"/>
-                <w:lang w:val="en-US"/>
-              </w:rPr>
-              <w:t xml:space="preserve"> reported crisis probabilities</w:t>
-            </w:r>
-            <w:r>
-              <w:rPr>
-                <w:sz w:val="24"/>
-                <w:szCs w:val="28"/>
-                <w:lang w:val="en-US"/>
-              </w:rPr>
-              <w:t xml:space="preserve"> to management on a quarterly basis</w:t>
-            </w:r>
-            <w:r>
-              <w:rPr>
-                <w:sz w:val="24"/>
-                <w:szCs w:val="28"/>
-                <w:lang w:val="en-US"/>
-              </w:rPr>
-              <w:t>.</w:t>
+              <w:t>Using machine learning</w:t>
+            </w:r>
+            <w:r>
+              <w:rPr>
+                <w:sz w:val="24"/>
+                <w:szCs w:val="28"/>
+                <w:lang w:val="en-US"/>
+              </w:rPr>
+              <w:t xml:space="preserve"> techniques</w:t>
+            </w:r>
+            <w:r>
+              <w:rPr>
+                <w:sz w:val="24"/>
+                <w:szCs w:val="28"/>
+                <w:lang w:val="en-US"/>
+              </w:rPr>
+              <w:t xml:space="preserve">, operated and fine-tuned </w:t>
+            </w:r>
+            <w:r>
+              <w:rPr>
+                <w:sz w:val="24"/>
+                <w:szCs w:val="28"/>
+                <w:lang w:val="en-US"/>
+              </w:rPr>
+              <w:t xml:space="preserve">all </w:t>
+            </w:r>
+            <w:r>
+              <w:rPr>
+                <w:sz w:val="24"/>
+                <w:szCs w:val="28"/>
+                <w:lang w:val="en-US"/>
+              </w:rPr>
+              <w:t>crisis prediction models</w:t>
+            </w:r>
+            <w:r>
+              <w:rPr>
+                <w:sz w:val="24"/>
+                <w:szCs w:val="28"/>
+                <w:lang w:val="en-US"/>
+              </w:rPr>
+              <w:t xml:space="preserve"> </w:t>
+            </w:r>
+            <w:r>
+              <w:rPr>
+                <w:sz w:val="24"/>
+                <w:szCs w:val="28"/>
+                <w:lang w:val="en-US"/>
+              </w:rPr>
+              <w:t xml:space="preserve">the IMF’s Macro Risk unit currently uses, including on fiscal, financial, external, and real sectors. </w:t>
             </w:r>
           </w:p>
           <w:p>
@@ -382,111 +387,15 @@
                 <w:szCs w:val="28"/>
                 <w:lang w:val="en-US"/>
               </w:rPr>
-              <w:t xml:space="preserve">Led </w:t>
-            </w:r>
-            <w:r>
-              <w:rPr>
-                <w:sz w:val="24"/>
-                <w:szCs w:val="28"/>
-                <w:lang w:val="en-US"/>
-              </w:rPr>
-              <w:t xml:space="preserve">a group </w:t>
-            </w:r>
-            <w:r>
-              <w:rPr>
-                <w:sz w:val="24"/>
-                <w:szCs w:val="28"/>
-                <w:lang w:val="en-US"/>
-              </w:rPr>
-              <w:t>of</w:t>
-            </w:r>
-            <w:r>
-              <w:rPr>
-                <w:sz w:val="24"/>
-                <w:szCs w:val="28"/>
-                <w:lang w:val="en-US"/>
-              </w:rPr>
-              <w:t xml:space="preserve"> 3 </w:t>
-            </w:r>
-            <w:r>
-              <w:rPr>
-                <w:sz w:val="24"/>
-                <w:szCs w:val="28"/>
-                <w:lang w:val="en-US"/>
-              </w:rPr>
-              <w:t>RAs</w:t>
-            </w:r>
-            <w:r>
-              <w:rPr>
-                <w:sz w:val="24"/>
-                <w:szCs w:val="28"/>
-                <w:lang w:val="en-US"/>
-              </w:rPr>
-              <w:t xml:space="preserve"> in collecting and analyzing macroeconomic</w:t>
-            </w:r>
-            <w:r>
-              <w:rPr>
-                <w:sz w:val="24"/>
-                <w:szCs w:val="28"/>
-                <w:lang w:val="en-US"/>
-              </w:rPr>
-              <w:t xml:space="preserve"> data </w:t>
-            </w:r>
-            <w:r>
-              <w:rPr>
-                <w:sz w:val="24"/>
-                <w:szCs w:val="28"/>
-                <w:lang w:val="en-US"/>
-              </w:rPr>
-              <w:t>for</w:t>
-            </w:r>
-            <w:r>
-              <w:rPr>
-                <w:sz w:val="24"/>
-                <w:szCs w:val="28"/>
-                <w:lang w:val="en-US"/>
-              </w:rPr>
-              <w:t xml:space="preserve"> the IMF’s </w:t>
-            </w:r>
-            <w:r>
-              <w:rPr>
-                <w:sz w:val="24"/>
-                <w:szCs w:val="28"/>
-                <w:lang w:val="en-US"/>
-              </w:rPr>
-              <w:t>flagship</w:t>
-            </w:r>
-            <w:r>
-              <w:rPr>
-                <w:sz w:val="24"/>
-                <w:szCs w:val="28"/>
-                <w:lang w:val="en-US"/>
-              </w:rPr>
-              <w:t xml:space="preserve"> publication</w:t>
-            </w:r>
-            <w:r>
-              <w:rPr>
-                <w:sz w:val="24"/>
-                <w:szCs w:val="28"/>
-                <w:lang w:val="en-US"/>
-              </w:rPr>
-              <w:t xml:space="preserve"> on low-income countries; and</w:t>
-            </w:r>
-            <w:r>
-              <w:rPr>
-                <w:sz w:val="24"/>
-                <w:szCs w:val="28"/>
-                <w:lang w:val="en-US"/>
-              </w:rPr>
-              <w:t xml:space="preserve"> develop</w:t>
-            </w:r>
-            <w:r>
-              <w:rPr>
-                <w:sz w:val="24"/>
-                <w:szCs w:val="28"/>
-                <w:lang w:val="en-US"/>
-              </w:rPr>
-              <w:t>ed</w:t>
+              <w:t xml:space="preserve">Designed and </w:t>
+            </w:r>
+            <w:r>
+              <w:rPr>
+                <w:sz w:val="24"/>
+                <w:szCs w:val="28"/>
+                <w:lang w:val="en-US"/>
+              </w:rPr>
+              <w:t>wrote the code to produce</w:t>
             </w:r>
             <w:r>
               <w:rPr>
@@ -502,15 +411,55 @@
                 <w:szCs w:val="28"/>
                 <w:lang w:val="en-US"/>
               </w:rPr>
-              <w:t>innovative</w:t>
-            </w:r>
-            <w:r>
-              <w:rPr>
-                <w:sz w:val="24"/>
-                <w:szCs w:val="28"/>
-                <w:lang w:val="en-US"/>
-              </w:rPr>
-              <w:t xml:space="preserve"> graphics for publication. </w:t>
+              <w:t xml:space="preserve">automated </w:t>
+            </w:r>
+            <w:r>
+              <w:rPr>
+                <w:sz w:val="24"/>
+                <w:szCs w:val="28"/>
+                <w:lang w:val="en-US"/>
+              </w:rPr>
+              <w:t xml:space="preserve">data visualizations </w:t>
+            </w:r>
+            <w:r>
+              <w:rPr>
+                <w:sz w:val="24"/>
+                <w:szCs w:val="28"/>
+                <w:lang w:val="en-US"/>
+              </w:rPr>
+              <w:t>for internal reporting</w:t>
+            </w:r>
+            <w:r>
+              <w:rPr>
+                <w:sz w:val="24"/>
+                <w:szCs w:val="28"/>
+                <w:lang w:val="en-US"/>
+              </w:rPr>
+              <w:t xml:space="preserve"> </w:t>
+            </w:r>
+            <w:r>
+              <w:rPr>
+                <w:sz w:val="24"/>
+                <w:szCs w:val="28"/>
+                <w:lang w:val="en-US"/>
+              </w:rPr>
+              <w:t>and presentation to Management on a semi-annual basis</w:t>
+            </w:r>
+            <w:r>
+              <w:rPr>
+                <w:sz w:val="24"/>
+                <w:szCs w:val="28"/>
+                <w:lang w:val="en-US"/>
+              </w:rPr>
+              <w:t xml:space="preserve"> under the Vulnerability Exercise</w:t>
+            </w:r>
+            <w:r>
+              <w:rPr>
+                <w:sz w:val="24"/>
+                <w:szCs w:val="28"/>
+                <w:lang w:val="en-US"/>
+              </w:rPr>
+              <w:t xml:space="preserve">. </w:t>
             </w:r>
           </w:p>
           <w:p>
@@ -534,47 +483,25 @@
                 <w:szCs w:val="28"/>
                 <w:lang w:val="en-US"/>
               </w:rPr>
-              <w:t>Managed the macro-economic framework for</w:t>
-            </w:r>
-            <w:r>
-              <w:rPr>
-                <w:sz w:val="24"/>
-                <w:szCs w:val="28"/>
-                <w:lang w:val="en-US"/>
-              </w:rPr>
-              <w:t xml:space="preserve"> Algeria, Libya, Morocco, and Tunisia</w:t>
-            </w:r>
-            <w:r>
-              <w:rPr>
-                <w:sz w:val="24"/>
-                <w:szCs w:val="28"/>
-                <w:lang w:val="en-US"/>
-              </w:rPr>
-              <w:t xml:space="preserve">, </w:t>
-            </w:r>
-            <w:r>
-              <w:rPr>
-                <w:sz w:val="24"/>
-                <w:szCs w:val="28"/>
-                <w:lang w:val="en-US"/>
-              </w:rPr>
-              <w:t>including communicating with national authorities, producing forecasts for the World Economic Outlook, and developing charts for publication</w:t>
-            </w:r>
-            <w:r>
-              <w:rPr>
-                <w:sz w:val="24"/>
-                <w:szCs w:val="28"/>
-                <w:lang w:val="en-US"/>
-              </w:rPr>
-              <w:t xml:space="preserve"> in Article IV consultations</w:t>
-            </w:r>
-            <w:r>
-              <w:rPr>
-                <w:sz w:val="24"/>
-                <w:szCs w:val="28"/>
-                <w:lang w:val="en-US"/>
-              </w:rPr>
-              <w:t>.</w:t>
+              <w:t xml:space="preserve">Constructed the Vulnerability Exercise database, upon which </w:t>
+            </w:r>
+            <w:proofErr w:type="gramStart"/>
+            <w:r>
+              <w:rPr>
+                <w:sz w:val="24"/>
+                <w:szCs w:val="28"/>
+                <w:lang w:val="en-US"/>
+              </w:rPr>
+              <w:t>reports</w:t>
+            </w:r>
+            <w:proofErr w:type="gramEnd"/>
+            <w:r>
+              <w:rPr>
+                <w:sz w:val="24"/>
+                <w:szCs w:val="28"/>
+                <w:lang w:val="en-US"/>
+              </w:rPr>
+              <w:t xml:space="preserve"> and models depend.</w:t>
             </w:r>
           </w:p>
           <w:p>
@@ -598,7 +525,279 @@
                 <w:szCs w:val="28"/>
                 <w:lang w:val="en-US"/>
               </w:rPr>
-              <w:t>Selected as the departmental Innovation Champion for designing a metadata search tool to search economic series within internal databases.</w:t>
+              <w:t>Managed</w:t>
+            </w:r>
+            <w:r>
+              <w:rPr>
+                <w:sz w:val="24"/>
+                <w:szCs w:val="28"/>
+                <w:lang w:val="en-US"/>
+              </w:rPr>
+              <w:t xml:space="preserve"> </w:t>
+            </w:r>
+            <w:r>
+              <w:rPr>
+                <w:sz w:val="24"/>
+                <w:szCs w:val="28"/>
+                <w:lang w:val="en-US"/>
+              </w:rPr>
+              <w:t>a group of 3 Analysts in collecting, analyzing, and maintaining macroeconomic</w:t>
+            </w:r>
+            <w:r>
+              <w:rPr>
+                <w:sz w:val="24"/>
+                <w:szCs w:val="28"/>
+                <w:lang w:val="en-US"/>
+              </w:rPr>
+              <w:t xml:space="preserve"> data</w:t>
+            </w:r>
+            <w:r>
+              <w:rPr>
+                <w:sz w:val="24"/>
+                <w:szCs w:val="28"/>
+                <w:lang w:val="en-US"/>
+              </w:rPr>
+              <w:t xml:space="preserve"> in structured databases</w:t>
+            </w:r>
+            <w:r>
+              <w:rPr>
+                <w:sz w:val="24"/>
+                <w:szCs w:val="28"/>
+                <w:lang w:val="en-US"/>
+              </w:rPr>
+              <w:t xml:space="preserve"> </w:t>
+            </w:r>
+            <w:r>
+              <w:rPr>
+                <w:sz w:val="24"/>
+                <w:szCs w:val="28"/>
+                <w:lang w:val="en-US"/>
+              </w:rPr>
+              <w:t>for</w:t>
+            </w:r>
+            <w:r>
+              <w:rPr>
+                <w:sz w:val="24"/>
+                <w:szCs w:val="28"/>
+                <w:lang w:val="en-US"/>
+              </w:rPr>
+              <w:t xml:space="preserve"> use in</w:t>
+            </w:r>
+            <w:r>
+              <w:rPr>
+                <w:sz w:val="24"/>
+                <w:szCs w:val="28"/>
+                <w:lang w:val="en-US"/>
+              </w:rPr>
+              <w:t xml:space="preserve"> the IMF’s </w:t>
+            </w:r>
+            <w:r>
+              <w:rPr>
+                <w:sz w:val="24"/>
+                <w:szCs w:val="28"/>
+                <w:lang w:val="en-US"/>
+              </w:rPr>
+              <w:t>flagship</w:t>
+            </w:r>
+            <w:r>
+              <w:rPr>
+                <w:sz w:val="24"/>
+                <w:szCs w:val="28"/>
+                <w:lang w:val="en-US"/>
+              </w:rPr>
+              <w:t xml:space="preserve"> publication</w:t>
+            </w:r>
+            <w:r>
+              <w:rPr>
+                <w:sz w:val="24"/>
+                <w:szCs w:val="28"/>
+                <w:lang w:val="en-US"/>
+              </w:rPr>
+              <w:t xml:space="preserve"> on low-income countries.</w:t>
+            </w:r>
+          </w:p>
+          <w:p>
+            <w:pPr>
+              <w:pStyle w:val="Puesto"/>
+              <w:spacing w:after="0" w:line="276" w:lineRule="auto"/>
+              <w:ind w:left="350"/>
+              <w:rPr>
+                <w:sz w:val="28"/>
+                <w:szCs w:val="32"/>
+              </w:rPr>
+            </w:pPr>
+            <w:r>
+              <w:rPr>
+                <w:sz w:val="28"/>
+                <w:szCs w:val="32"/>
+              </w:rPr>
+              <w:t>Middle East and Central Asia</w:t>
+            </w:r>
+            <w:r>
+              <w:rPr>
+                <w:sz w:val="28"/>
+                <w:szCs w:val="32"/>
+              </w:rPr>
+              <w:t xml:space="preserve"> Department</w:t>
+            </w:r>
+            <w:r>
+              <w:rPr>
+                <w:sz w:val="28"/>
+                <w:szCs w:val="32"/>
+              </w:rPr>
+              <w:t xml:space="preserve"> (until Feb. 2019)</w:t>
+            </w:r>
+          </w:p>
+          <w:p>
+            <w:pPr>
+              <w:pStyle w:val="Logro"/>
+              <w:numPr>
+                <w:ilvl w:val="0"/>
+                <w:numId w:val="17"/>
+              </w:numPr>
+              <w:spacing w:after="0" w:line="276" w:lineRule="auto"/>
+              <w:ind w:left="610" w:hanging="270"/>
+              <w:rPr>
+                <w:sz w:val="24"/>
+                <w:szCs w:val="28"/>
+                <w:lang w:val="en-US"/>
+              </w:rPr>
+            </w:pPr>
+            <w:r>
+              <w:rPr>
+                <w:sz w:val="24"/>
+                <w:szCs w:val="28"/>
+                <w:lang w:val="en-US"/>
+              </w:rPr>
+              <w:t>Managed the macro-framework for</w:t>
+            </w:r>
+            <w:r>
+              <w:rPr>
+                <w:sz w:val="24"/>
+                <w:szCs w:val="28"/>
+                <w:lang w:val="en-US"/>
+              </w:rPr>
+              <w:t xml:space="preserve"> Algeria, Libya, Morocco, and Tunisia</w:t>
+            </w:r>
+            <w:r>
+              <w:rPr>
+                <w:sz w:val="24"/>
+                <w:szCs w:val="28"/>
+                <w:lang w:val="en-US"/>
+              </w:rPr>
+              <w:t xml:space="preserve">, </w:t>
+            </w:r>
+            <w:r>
+              <w:rPr>
+                <w:sz w:val="24"/>
+                <w:szCs w:val="28"/>
+                <w:lang w:val="en-US"/>
+              </w:rPr>
+              <w:t>and prepared documents for use in program negotiations. Additionally, p</w:t>
+            </w:r>
+            <w:r>
+              <w:rPr>
+                <w:sz w:val="24"/>
+                <w:szCs w:val="28"/>
+                <w:lang w:val="en-US"/>
+              </w:rPr>
+              <w:t xml:space="preserve">roduced </w:t>
+            </w:r>
+            <w:r>
+              <w:rPr>
+                <w:sz w:val="24"/>
+                <w:szCs w:val="28"/>
+                <w:lang w:val="en-US"/>
+              </w:rPr>
+              <w:t xml:space="preserve">forecasts for </w:t>
+            </w:r>
+            <w:r>
+              <w:rPr>
+                <w:sz w:val="24"/>
+                <w:szCs w:val="28"/>
+                <w:lang w:val="en-US"/>
+              </w:rPr>
+              <w:t xml:space="preserve">use in </w:t>
+            </w:r>
+            <w:r>
+              <w:rPr>
+                <w:sz w:val="24"/>
+                <w:szCs w:val="28"/>
+                <w:lang w:val="en-US"/>
+              </w:rPr>
+              <w:t>the World Economic Outlook and charts for publication</w:t>
+            </w:r>
+            <w:r>
+              <w:rPr>
+                <w:sz w:val="24"/>
+                <w:szCs w:val="28"/>
+                <w:lang w:val="en-US"/>
+              </w:rPr>
+              <w:t xml:space="preserve"> in Article IV </w:t>
+            </w:r>
+            <w:r>
+              <w:rPr>
+                <w:sz w:val="24"/>
+                <w:szCs w:val="28"/>
+                <w:lang w:val="en-US"/>
+              </w:rPr>
+              <w:t>reports</w:t>
+            </w:r>
+            <w:r>
+              <w:rPr>
+                <w:sz w:val="24"/>
+                <w:szCs w:val="28"/>
+                <w:lang w:val="en-US"/>
+              </w:rPr>
+              <w:t>.</w:t>
+            </w:r>
+          </w:p>
+          <w:p>
+            <w:pPr>
+              <w:pStyle w:val="Logro"/>
+              <w:numPr>
+                <w:ilvl w:val="0"/>
+                <w:numId w:val="17"/>
+              </w:numPr>
+              <w:spacing w:after="0" w:line="276" w:lineRule="auto"/>
+              <w:ind w:left="610" w:hanging="270"/>
+              <w:rPr>
+                <w:sz w:val="24"/>
+                <w:szCs w:val="28"/>
+                <w:lang w:val="en-US"/>
+              </w:rPr>
+            </w:pPr>
+            <w:r>
+              <w:rPr>
+                <w:sz w:val="24"/>
+                <w:szCs w:val="28"/>
+                <w:lang w:val="en-US"/>
+              </w:rPr>
+              <w:t xml:space="preserve">Selected as the departmental Innovation Champion for </w:t>
+            </w:r>
+            <w:r>
+              <w:rPr>
+                <w:sz w:val="24"/>
+                <w:szCs w:val="28"/>
+                <w:lang w:val="en-US"/>
+              </w:rPr>
+              <w:t>building</w:t>
+            </w:r>
+            <w:r>
+              <w:rPr>
+                <w:sz w:val="24"/>
+                <w:szCs w:val="28"/>
+                <w:lang w:val="en-US"/>
+              </w:rPr>
+              <w:t xml:space="preserve"> a metadata search tool</w:t>
+            </w:r>
+            <w:r>
+              <w:rPr>
+                <w:sz w:val="24"/>
+                <w:szCs w:val="28"/>
+                <w:lang w:val="en-US"/>
+              </w:rPr>
+              <w:t>, which resulted in dramatic efficiency gains for analysts and economists.</w:t>
             </w:r>
           </w:p>
           <w:p>
@@ -1022,164 +1221,6 @@
       </w:tr>
       <w:tr>
         <w:trPr>
-          <w:trHeight w:val="1190"/>
-        </w:trPr>
-        <w:tc>
-          <w:tcPr>
-            <w:tcW w:w="9720" w:type="dxa"/>
-            <w:tcBorders>
-              <w:top w:val="nil"/>
-              <w:left w:val="nil"/>
-              <w:bottom w:val="nil"/>
-              <w:right w:val="nil"/>
-            </w:tcBorders>
-          </w:tcPr>
-          <w:p>
-            <w:pPr>
-              <w:pStyle w:val="Logro"/>
-              <w:numPr>
-                <w:ilvl w:val="0"/>
-                <w:numId w:val="0"/>
-              </w:numPr>
-              <w:spacing w:after="0"/>
-              <w:ind w:left="607" w:hanging="240"/>
-              <w:jc w:val="left"/>
-              <w:rPr>
-                <w:rFonts w:ascii="Arial" w:hAnsi="Arial" w:cs="Arial"/>
-                <w:b/>
-                <w:sz w:val="24"/>
-                <w:szCs w:val="28"/>
-                <w:lang w:val="en-US"/>
-              </w:rPr>
-            </w:pPr>
-            <w:r>
-              <w:rPr>
-                <w:rFonts w:ascii="Arial" w:hAnsi="Arial" w:cs="Arial"/>
-                <w:b/>
-                <w:sz w:val="24"/>
-                <w:szCs w:val="28"/>
-                <w:lang w:val="en-US"/>
-              </w:rPr>
-              <w:t>EXECUTIVE MAGAZINE</w:t>
-            </w:r>
-          </w:p>
-          <w:p>
-            <w:pPr>
-              <w:pStyle w:val="Puesto"/>
-              <w:spacing w:after="0" w:line="276" w:lineRule="auto"/>
-              <w:ind w:left="337"/>
-              <w:rPr>
-                <w:sz w:val="24"/>
-                <w:szCs w:val="28"/>
-              </w:rPr>
-            </w:pPr>
-            <w:r>
-              <w:rPr>
-                <w:sz w:val="28"/>
-                <w:szCs w:val="32"/>
-              </w:rPr>
-              <w:t>Intern</w:t>
-            </w:r>
-          </w:p>
-          <w:p>
-            <w:pPr>
-              <w:pStyle w:val="Logro"/>
-              <w:tabs>
-                <w:tab w:val="clear" w:pos="360"/>
-              </w:tabs>
-              <w:spacing w:after="0" w:line="240" w:lineRule="auto"/>
-              <w:ind w:left="607" w:hanging="270"/>
-              <w:jc w:val="left"/>
-              <w:rPr>
-                <w:sz w:val="24"/>
-                <w:szCs w:val="28"/>
-                <w:lang w:val="en-US"/>
-              </w:rPr>
-            </w:pPr>
-            <w:r>
-              <w:rPr>
-                <w:sz w:val="24"/>
-                <w:szCs w:val="28"/>
-                <w:lang w:val="en-US"/>
-              </w:rPr>
-              <w:t>Published 2 articles on the spillover effects from the civil unrest in Syria</w:t>
-            </w:r>
-            <w:r>
-              <w:rPr>
-                <w:sz w:val="24"/>
-                <w:szCs w:val="28"/>
-                <w:lang w:val="en-US"/>
-              </w:rPr>
-              <w:t>.</w:t>
-            </w:r>
-          </w:p>
-        </w:tc>
-        <w:tc>
-          <w:tcPr>
-            <w:tcW w:w="1800" w:type="dxa"/>
-            <w:gridSpan w:val="2"/>
-            <w:tcBorders>
-              <w:top w:val="nil"/>
-              <w:left w:val="nil"/>
-              <w:bottom w:val="nil"/>
-              <w:right w:val="nil"/>
-            </w:tcBorders>
-          </w:tcPr>
-          <w:p>
-            <w:pPr>
-              <w:pStyle w:val="Institucin"/>
-              <w:tabs>
-                <w:tab w:val="clear" w:pos="1440"/>
-                <w:tab w:val="clear" w:pos="6480"/>
-                <w:tab w:val="left" w:pos="6521"/>
-              </w:tabs>
-              <w:spacing w:line="240" w:lineRule="auto"/>
-              <w:ind w:left="-43" w:right="-109" w:firstLine="23"/>
-              <w:jc w:val="left"/>
-              <w:rPr>
-                <w:sz w:val="24"/>
-                <w:szCs w:val="28"/>
-                <w:lang w:val="en-US"/>
-              </w:rPr>
-            </w:pPr>
-            <w:r>
-              <w:rPr>
-                <w:sz w:val="24"/>
-                <w:szCs w:val="28"/>
-                <w:lang w:val="en-US"/>
-              </w:rPr>
-              <w:t>2013</w:t>
-            </w:r>
-          </w:p>
-          <w:p>
-            <w:pPr>
-              <w:pStyle w:val="Institucin"/>
-              <w:tabs>
-                <w:tab w:val="clear" w:pos="1440"/>
-                <w:tab w:val="clear" w:pos="6480"/>
-                <w:tab w:val="left" w:pos="6521"/>
-              </w:tabs>
-              <w:spacing w:line="240" w:lineRule="auto"/>
-              <w:ind w:left="-43" w:right="-109" w:firstLine="23"/>
-              <w:jc w:val="left"/>
-              <w:rPr>
-                <w:sz w:val="24"/>
-                <w:szCs w:val="28"/>
-              </w:rPr>
-            </w:pPr>
-            <w:r>
-              <w:rPr>
-                <w:sz w:val="24"/>
-                <w:szCs w:val="28"/>
-                <w:lang w:val="en-US"/>
-              </w:rPr>
-              <w:t>Beirut</w:t>
-            </w:r>
-          </w:p>
-        </w:tc>
-      </w:tr>
-      <w:tr>
-        <w:trPr>
           <w:gridAfter w:val="1"/>
           <w:wAfter w:w="90" w:type="dxa"/>
           <w:trHeight w:val="281"/>
@@ -1222,7 +1263,7 @@
         <w:trPr>
           <w:gridAfter w:val="1"/>
           <w:wAfter w:w="90" w:type="dxa"/>
-          <w:trHeight w:val="1315"/>
+          <w:trHeight w:val="1072"/>
         </w:trPr>
         <w:tc>
           <w:tcPr>
@@ -1235,23 +1276,6 @@
               <w:right w:val="nil"/>
             </w:tcBorders>
           </w:tcPr>
-          <w:p>
-            <w:pPr>
-              <w:pStyle w:val="Logro"/>
-              <w:numPr>
-                <w:ilvl w:val="0"/>
-                <w:numId w:val="0"/>
-              </w:numPr>
-              <w:spacing w:after="0"/>
-              <w:rPr>
-                <w:rFonts w:ascii="Arial" w:hAnsi="Arial" w:cs="Arial"/>
-                <w:b/>
-                <w:sz w:val="24"/>
-                <w:szCs w:val="28"/>
-                <w:lang w:val="en-US"/>
-              </w:rPr>
-            </w:pPr>
-          </w:p>
           <w:p>
             <w:pPr>
               <w:pStyle w:val="Institucin"/>
@@ -1716,7 +1740,7 @@
                 <w:numId w:val="0"/>
               </w:numPr>
               <w:spacing w:after="0" w:line="276" w:lineRule="auto"/>
-              <w:ind w:left="240" w:right="-616" w:hanging="240"/>
+              <w:ind w:left="240" w:hanging="240"/>
               <w:rPr>
                 <w:sz w:val="24"/>
                 <w:szCs w:val="28"/>
@@ -1758,6 +1782,65 @@
           <w:lang w:val="en-US"/>
         </w:rPr>
       </w:pPr>
+      <w:r>
+        <w:fldChar w:fldCharType="begin"/>
+      </w:r>
+      <w:r>
+        <w:instrText xml:space="preserve"> HYPERLINK "https://www.imf.org/en/Publications/WP/Issues/2020/08/14/Investor-Sentiment-Sovereign-Debt-Mispricing-and-Economic-Outcomes-49569" </w:instrText>
+      </w:r>
+      <w:r>
+        <w:fldChar w:fldCharType="separate"/>
+      </w:r>
+      <w:r>
+        <w:rPr>
+          <w:rStyle w:val="Hyperlink"/>
+          <w:sz w:val="24"/>
+          <w:szCs w:val="28"/>
+          <w:lang w:val="en-US"/>
+        </w:rPr>
+        <w:t>Investor Sentiment, Sovereign Debt Mispricing, and Economic Outcomes</w:t>
+      </w:r>
+      <w:r>
+        <w:rPr>
+          <w:rStyle w:val="Hyperlink"/>
+          <w:sz w:val="24"/>
+          <w:szCs w:val="28"/>
+          <w:lang w:val="en-US"/>
+        </w:rPr>
+        <w:t>;</w:t>
+      </w:r>
+      <w:r>
+        <w:rPr>
+          <w:rStyle w:val="Hyperlink"/>
+          <w:sz w:val="24"/>
+          <w:szCs w:val="28"/>
+          <w:lang w:val="en-US"/>
+        </w:rPr>
+        <w:fldChar w:fldCharType="end"/>
+      </w:r>
+      <w:r>
+        <w:rPr>
+          <w:sz w:val="24"/>
+          <w:szCs w:val="28"/>
+          <w:lang w:val="en-US"/>
+        </w:rPr>
+        <w:t xml:space="preserve"> IMF Working Paper, Aug. 2020</w:t>
+      </w:r>
+    </w:p>
+    <w:p>
+      <w:pPr>
+        <w:pStyle w:val="Logro"/>
+        <w:tabs>
+          <w:tab w:val="clear" w:pos="360"/>
+        </w:tabs>
+        <w:spacing w:after="0" w:line="276" w:lineRule="auto"/>
+        <w:ind w:left="700" w:hanging="345"/>
+        <w:rPr>
+          <w:sz w:val="24"/>
+          <w:szCs w:val="28"/>
+          <w:lang w:val="en-US"/>
+        </w:rPr>
+      </w:pPr>
       <w:hyperlink r:id="rId9" w:history="1">
         <w:r>
           <w:rPr>
@@ -1766,16 +1849,7 @@
             <w:szCs w:val="28"/>
             <w:lang w:val="en-US"/>
           </w:rPr>
-          <w:t>Investor Sentiment, Sovereign Debt Mispricing, and Economic Outcomes</w:t>
-        </w:r>
-        <w:r>
-          <w:rPr>
-            <w:rStyle w:val="Hyperlink"/>
-            <w:sz w:val="24"/>
-            <w:szCs w:val="28"/>
-            <w:lang w:val="en-US"/>
-          </w:rPr>
-          <w:t>;</w:t>
+          <w:t>Quantifying the Contribution of NBA Coaches using Fixed Effects</w:t>
         </w:r>
       </w:hyperlink>
       <w:r>
@@ -1784,7 +1858,7 @@
           <w:szCs w:val="28"/>
           <w:lang w:val="en-US"/>
         </w:rPr>
-        <w:t xml:space="preserve"> IMF Working Paper, Aug. 2020</w:t>
+        <w:t>; Article on Medium, Oct. 2020</w:t>
       </w:r>
     </w:p>
     <w:p>
@@ -1852,7 +1926,7 @@
           <w:szCs w:val="28"/>
           <w:lang w:val="en-US"/>
         </w:rPr>
-        <w:t xml:space="preserve"> Magazine Article, Aug. 2013</w:t>
+        <w:t xml:space="preserve"> Article, Aug. 2013</w:t>
       </w:r>
     </w:p>
     <w:p>
@@ -1877,25 +1951,7 @@
             <w:szCs w:val="28"/>
             <w:lang w:val="en-US"/>
           </w:rPr>
-          <w:t>‘</w:t>
-        </w:r>
-        <w:r>
-          <w:rPr>
-            <w:rStyle w:val="Hyperlink"/>
-            <w:sz w:val="24"/>
-            <w:szCs w:val="28"/>
-            <w:lang w:val="en-US"/>
-          </w:rPr>
-          <w:t xml:space="preserve">Politics is stopping us </w:t>
-        </w:r>
-        <w:r>
-          <w:rPr>
-            <w:rStyle w:val="Hyperlink"/>
-            <w:sz w:val="24"/>
-            <w:szCs w:val="28"/>
-            <w:lang w:val="en-US"/>
-          </w:rPr>
-          <w:t>help Syrians’</w:t>
+          <w:t>Politics is Stopping us Help Syrians;</w:t>
         </w:r>
       </w:hyperlink>
       <w:r>
@@ -1904,8 +1960,39 @@
           <w:szCs w:val="28"/>
           <w:lang w:val="en-US"/>
         </w:rPr>
-        <w:t>; Interview, Aug. 2013</w:t>
+        <w:t xml:space="preserve"> </w:t>
       </w:r>
+      <w:r>
+        <w:rPr>
+          <w:sz w:val="24"/>
+          <w:szCs w:val="28"/>
+          <w:lang w:val="en-US"/>
+        </w:rPr>
+        <w:t>Interview with Government Official</w:t>
+      </w:r>
+      <w:r>
+        <w:rPr>
+          <w:sz w:val="24"/>
+          <w:szCs w:val="28"/>
+          <w:lang w:val="en-US"/>
+        </w:rPr>
+        <w:t>; Aug. 2013</w:t>
+      </w:r>
+    </w:p>
+    <w:p>
+      <w:pPr>
+        <w:pStyle w:val="Logro"/>
+        <w:numPr>
+          <w:ilvl w:val="0"/>
+          <w:numId w:val="0"/>
+        </w:numPr>
+        <w:spacing w:after="0" w:line="276" w:lineRule="auto"/>
+        <w:rPr>
+          <w:sz w:val="24"/>
+          <w:szCs w:val="28"/>
+          <w:lang w:val="en-US"/>
+        </w:rPr>
+      </w:pPr>
     </w:p>
     <w:sectPr>
       <w:headerReference w:type="default" r:id="rId13"/>

</xml_diff>